<commit_message>
Define la variable objetivo del modelo y reescribe las preguntas al negocio
Variable objetivo:
- Comparacion de 5 candidatos sobre 131.189 filas (candidatos_target.py):
  se elige cobertura > 12 meses a 3 meses de horizonte, sobre posiciones con
  stock. Prevalencia 2,67%; es el candidato con menos inercia (la regla trivial
  solo saca 28,6% de recall)
- Se excluyen "sin ventas en 3 meses" (dispara por azar en el 22% de los SKUs
  de bajo volumen) y los discontinuados (decision ya tomada, y en 2026 no hay
  ninguno porque el catalogo esta congelado)
- Recordatorios/05-decisiones-modelo.md: la propuesta, en que se apoya cada
  decision, que candidatos se descartaron y que falta aprobar

Preguntas al negocio:
- Reescritas como preguntas abiertas, sin criterios provisorios ni respuestas
  sugeridas. Pasan de 22 a 32, con espacio para responder cada una

Co-Authored-By: Claude Opus 5 <noreply@anthropic.com>
</commit_message>
<xml_diff>
--- a/Entregable/Entregable 2/Preguntas-Calidad-de-Datos-Ronda-2.docx
+++ b/Entregable/Entregable 2/Preguntas-Calidad-de-Datos-Ronda-2.docx
@@ -48,7 +48,7 @@
       <w:tr>
         <w:tc>
           <w:tcPr>
-            <w:tcW w:type="dxa" w:w="2551"/>
+            <w:tcW w:type="dxa" w:w="2835"/>
           </w:tcPr>
           <w:p>
             <w:r/>
@@ -63,7 +63,7 @@
         </w:tc>
         <w:tc>
           <w:tcPr>
-            <w:tcW w:type="dxa" w:w="6803"/>
+            <w:tcW w:type="dxa" w:w="6520"/>
           </w:tcPr>
           <w:p>
             <w:r/>
@@ -80,7 +80,7 @@
       <w:tr>
         <w:tc>
           <w:tcPr>
-            <w:tcW w:type="dxa" w:w="2551"/>
+            <w:tcW w:type="dxa" w:w="2835"/>
           </w:tcPr>
           <w:p>
             <w:r/>
@@ -94,7 +94,7 @@
         </w:tc>
         <w:tc>
           <w:tcPr>
-            <w:tcW w:type="dxa" w:w="6803"/>
+            <w:tcW w:type="dxa" w:w="6520"/>
           </w:tcPr>
           <w:p>
             <w:r/>
@@ -102,7 +102,7 @@
               <w:rPr>
                 <w:sz w:val="19"/>
               </w:rPr>
-              <w:t>Análisis exploratorio y de calidad sobre los 15 datasets recibidos (período ene-2022 a dic-2025).</w:t>
+              <w:t>Análisis exploratorio y de calidad sobre los 15 datasets recibidos (período enero 2022 a agosto 2026).</w:t>
             </w:r>
           </w:p>
         </w:tc>
@@ -110,7 +110,7 @@
       <w:tr>
         <w:tc>
           <w:tcPr>
-            <w:tcW w:type="dxa" w:w="2551"/>
+            <w:tcW w:type="dxa" w:w="2835"/>
           </w:tcPr>
           <w:p>
             <w:r/>
@@ -124,7 +124,7 @@
         </w:tc>
         <w:tc>
           <w:tcPr>
-            <w:tcW w:type="dxa" w:w="6803"/>
+            <w:tcW w:type="dxa" w:w="6520"/>
           </w:tcPr>
           <w:p>
             <w:r/>
@@ -132,7 +132,7 @@
               <w:rPr>
                 <w:sz w:val="19"/>
               </w:rPr>
-              <w:t>Compras y Categorías (Diego P.), Dirección Financiera (Carlos F.), Dirección Comercial (María G.), Sistemas / referente técnico de Operaciones.</w:t>
+              <w:t>Compras y Categorías, Dirección Financiera, Dirección Comercial, Sistemas / referente técnico de Operaciones.</w:t>
             </w:r>
           </w:p>
         </w:tc>
@@ -140,7 +140,7 @@
       <w:tr>
         <w:tc>
           <w:tcPr>
-            <w:tcW w:type="dxa" w:w="2551"/>
+            <w:tcW w:type="dxa" w:w="2835"/>
           </w:tcPr>
           <w:p>
             <w:r/>
@@ -148,13 +148,13 @@
               <w:rPr>
                 <w:sz w:val="19"/>
               </w:rPr>
-              <w:t>Fecha</w:t>
+              <w:t>Fecha de envío</w:t>
             </w:r>
           </w:p>
         </w:tc>
         <w:tc>
           <w:tcPr>
-            <w:tcW w:type="dxa" w:w="6803"/>
+            <w:tcW w:type="dxa" w:w="6520"/>
           </w:tcPr>
           <w:p>
             <w:r/>
@@ -170,7 +170,7 @@
       <w:tr>
         <w:tc>
           <w:tcPr>
-            <w:tcW w:type="dxa" w:w="2551"/>
+            <w:tcW w:type="dxa" w:w="2835"/>
           </w:tcPr>
           <w:p>
             <w:r/>
@@ -178,13 +178,43 @@
               <w:rPr>
                 <w:sz w:val="19"/>
               </w:rPr>
-              <w:t>Respuestas</w:t>
+              <w:t>Fecha solicitada de respuesta</w:t>
             </w:r>
           </w:p>
         </w:tc>
         <w:tc>
           <w:tcPr>
-            <w:tcW w:type="dxa" w:w="6803"/>
+            <w:tcW w:type="dxa" w:w="6520"/>
+          </w:tcPr>
+          <w:p>
+            <w:r/>
+            <w:r>
+              <w:rPr>
+                <w:sz w:val="19"/>
+              </w:rPr>
+              <w:t>[completar]</w:t>
+            </w:r>
+          </w:p>
+        </w:tc>
+      </w:tr>
+      <w:tr>
+        <w:tc>
+          <w:tcPr>
+            <w:tcW w:type="dxa" w:w="2835"/>
+          </w:tcPr>
+          <w:p>
+            <w:r/>
+            <w:r>
+              <w:rPr>
+                <w:sz w:val="19"/>
+              </w:rPr>
+              <w:t>Respondido por</w:t>
+            </w:r>
+          </w:p>
+        </w:tc>
+        <w:tc>
+          <w:tcPr>
+            <w:tcW w:type="dxa" w:w="6520"/>
           </w:tcPr>
           <w:p>
             <w:r/>
@@ -212,7 +242,7 @@
           <w:b w:val="0"/>
           <w:i/>
         </w:rPr>
-        <w:t>Cada punto indica qué se detectó, por qué importa para el proyecto y qué criterio aplicaríamos si no hubiera respuesta. Los criterios provisorios están marcados como tales: no son decisiones tomadas.</w:t>
+        <w:t>Cada bloque empieza con lo que encontramos en los datos y sigue con las preguntas. No proponemos respuestas: necesitamos el criterio de ustedes para poder aplicarlo. Las preguntas están numeradas para facilitar la respuesta punto por punto, por escrito o en una reunión.</w:t>
       </w:r>
     </w:p>
     <w:p>
@@ -235,7 +265,7 @@
           <w:b/>
           <w:i w:val="0"/>
         </w:rPr>
-        <w:t>Qué se detectó</w:t>
+        <w:t>Qué encontramos en los datos</w:t>
       </w:r>
     </w:p>
     <w:p>
@@ -247,10 +277,10 @@
         <w:rPr>
           <w:b/>
         </w:rPr>
-        <w:t>22 de 800 SKUs (2,7%) no tienen cargado el costo unitario</w:t>
+        <w:t>22 de 800 productos (2,7%) no tienen cargado el costo unitario</w:t>
       </w:r>
       <w:r>
-        <w:t xml:space="preserve"> en Productos_catalogo.csv. Sí tienen precio de lista.</w:t>
+        <w:t xml:space="preserve"> en el catálogo. El precio de lista sí está cargado en los 22.</w:t>
       </w:r>
     </w:p>
     <w:p>
@@ -265,7 +295,7 @@
         <w:t xml:space="preserve">Los 22 son altas recientes: </w:t>
       </w:r>
       <w:r>
-        <w:t>todas sus fechas de alta están entre el 6-feb-2025 y el 27-jun-2025. Ningún SKU anterior a 2025 tiene el costo vacío.</w:t>
+        <w:t>sus fechas de alta van del 6 de febrero al 27 de junio de 2025. Ningún producto anterior a 2025 tiene el costo vacío.</w:t>
       </w:r>
     </w:p>
     <w:p>
@@ -277,10 +307,10 @@
         <w:rPr>
           <w:b/>
         </w:rPr>
-        <w:t xml:space="preserve">16 siguen activos y 6 fueron discontinuados. </w:t>
+        <w:t>16 siguen activos y 6 fueron discontinuados.</w:t>
       </w:r>
       <w:r>
-        <w:t>A dic-2025 tienen 2.610 unidades en stock repartidas en 192 posiciones SKU-tienda.</w:t>
+        <w:t xml:space="preserve"> Entre todos suman 2.610 unidades en stock, repartidas en 192 combinaciones de producto y tienda.</w:t>
       </w:r>
     </w:p>
     <w:p>
@@ -292,10 +322,10 @@
         <w:rPr>
           <w:b/>
         </w:rPr>
-        <w:t>Representan $235,7 M de venta acumulada (0,73% del total)</w:t>
+        <w:t>Acumulan $235,7 millones de venta</w:t>
       </w:r>
       <w:r>
-        <w:t>, pero su stock no se puede valuar a costo, que es la base del cálculo de capital inmovilizado.</w:t>
+        <w:t xml:space="preserve"> en el período analizado.</w:t>
       </w:r>
     </w:p>
     <w:p>
@@ -307,10 +337,25 @@
         <w:rPr>
           <w:b/>
         </w:rPr>
-        <w:t>Los 22 SKUs sí tienen órdenes de compra con costo cargado</w:t>
+        <w:t>Esos mismos 22 productos sí tienen costo cargado en sus órdenes de compra</w:t>
       </w:r>
       <w:r>
-        <w:t xml:space="preserve"> (entre 1 y 9 OC cada uno). El costo promedio ponderado por unidades va de $4.718 a $38.504.</w:t>
+        <w:t xml:space="preserve"> (entre 1 y 9 órdenes cada uno).</w:t>
+      </w:r>
+    </w:p>
+    <w:p>
+      <w:pPr>
+        <w:pStyle w:val="ListBullet"/>
+        <w:spacing w:after="40"/>
+      </w:pPr>
+      <w:r>
+        <w:rPr>
+          <w:b/>
+        </w:rPr>
+        <w:t xml:space="preserve">Tomando el costo de esas órdenes de compra, </w:t>
+      </w:r>
+      <w:r>
+        <w:t>el margen sobre precio de lista de estos 22 productos daría entre 52% y 58%, mientras que el resto del catálogo tiene un margen promedio de 45%.</w:t>
       </w:r>
     </w:p>
     <w:p>
@@ -322,7 +367,7 @@
           <w:b/>
           <w:i w:val="0"/>
         </w:rPr>
-        <w:t>Por qué importa</w:t>
+        <w:t>Por qué lo preguntamos</w:t>
       </w:r>
     </w:p>
     <w:p>
@@ -334,31 +379,7 @@
           <w:b w:val="0"/>
           <w:i w:val="0"/>
         </w:rPr>
-        <w:t>El capital inmovilizado —la cifra central del proyecto— se calcula valuando el stock a costo. Hoy estos SKUs quedan fuera de esa valuación o se estiman. En el Entregable 1 se imputaron con la mediana de costo de su categoría; comparado contra el costo real de las órdenes de compra, esa estimación se desvía un 11,9% en la mediana, con casos de −84% y +63%.</w:t>
-      </w:r>
-    </w:p>
-    <w:p>
-      <w:pPr>
-        <w:spacing w:after="80"/>
-      </w:pPr>
-      <w:r>
-        <w:rPr>
-          <w:b/>
-          <w:i w:val="0"/>
-        </w:rPr>
-        <w:t>Un dato que no cierra y necesita explicación</w:t>
-      </w:r>
-    </w:p>
-    <w:p>
-      <w:pPr>
-        <w:spacing w:after="80"/>
-      </w:pPr>
-      <w:r>
-        <w:rPr>
-          <w:b w:val="0"/>
-          <w:i w:val="0"/>
-        </w:rPr>
-        <w:t>Si se usara el costo de las órdenes de compra, estos 22 productos tendrían un margen sobre precio de lista de 52% a 58% (mediana 55,2%), muy por encima del 45,4% del resto del catálogo. O son productos genuinamente más rentables, o el costo de la orden de compra y el costo del catálogo no son la misma magnitud (por ejemplo, si el del catálogo incluye flete, impuestos o costos de importación que la OC no tiene).</w:t>
+        <w:t>El capital inmovilizado se calcula valuando el stock a costo. Sin ese dato, estos productos quedan fuera de la medición.</w:t>
       </w:r>
     </w:p>
     <w:p>
@@ -376,7 +397,25 @@
         <w:rPr>
           <w:b/>
         </w:rPr>
-        <w:t>¿Por qué quedaron sin costo justamente los productos dados de alta en 2025? ¿Cambió el circuito de carga de productos nuevos ese año?</w:t>
+        <w:t>¿Cuál es el circuito de carga del costo unitario de un producto nuevo? ¿Qué área lo carga y en qué momento del alta?</w:t>
+      </w:r>
+    </w:p>
+    <w:p>
+      <w:pPr>
+        <w:spacing w:after="160"/>
+      </w:pPr>
+      <w:r>
+        <w:rPr>
+          <w:i/>
+          <w:color w:val="808080"/>
+        </w:rPr>
+        <w:t xml:space="preserve">Respuesta: </w:t>
+      </w:r>
+      <w:r>
+        <w:rPr>
+          <w:color w:val="BFBFBF"/>
+        </w:rPr>
+        <w:t>______________________________________________________________________________</w:t>
       </w:r>
     </w:p>
     <w:p>
@@ -394,7 +433,25 @@
         <w:rPr>
           <w:b/>
         </w:rPr>
-        <w:t>¿Quién es hoy el responsable de cargar el costo unitario de un producto nuevo, y en qué momento del alta debería quedar cargado?</w:t>
+        <w:t>¿Qué explica que estos 22 productos, todos dados de alta en 2025, hayan quedado sin costo?</w:t>
+      </w:r>
+    </w:p>
+    <w:p>
+      <w:pPr>
+        <w:spacing w:after="160"/>
+      </w:pPr>
+      <w:r>
+        <w:rPr>
+          <w:i/>
+          <w:color w:val="808080"/>
+        </w:rPr>
+        <w:t xml:space="preserve">Respuesta: </w:t>
+      </w:r>
+      <w:r>
+        <w:rPr>
+          <w:color w:val="BFBFBF"/>
+        </w:rPr>
+        <w:t>______________________________________________________________________________</w:t>
       </w:r>
     </w:p>
     <w:p>
@@ -412,7 +469,25 @@
         <w:rPr>
           <w:b/>
         </w:rPr>
-        <w:t>¿El costo_unitario del catálogo es el mismo concepto que el costo_unitario_ars de una orden de compra, o el del catálogo incluye componentes adicionales (flete, impuestos, nacionalización)? Esto define si podemos completar los faltantes desde las órdenes de compra.</w:t>
+        <w:t>¿Qué incluye exactamente el costo unitario del catálogo? ¿Es el precio de compra al proveedor, o incorpora otros componentes como flete, impuestos o nacionalización?</w:t>
+      </w:r>
+    </w:p>
+    <w:p>
+      <w:pPr>
+        <w:spacing w:after="160"/>
+      </w:pPr>
+      <w:r>
+        <w:rPr>
+          <w:i/>
+          <w:color w:val="808080"/>
+        </w:rPr>
+        <w:t xml:space="preserve">Respuesta: </w:t>
+      </w:r>
+      <w:r>
+        <w:rPr>
+          <w:color w:val="BFBFBF"/>
+        </w:rPr>
+        <w:t>______________________________________________________________________________</w:t>
       </w:r>
     </w:p>
     <w:p>
@@ -430,7 +505,25 @@
         <w:rPr>
           <w:b/>
         </w:rPr>
-        <w:t>Si podemos usar las órdenes de compra: ¿qué criterio prefieren, el costo de la última orden, el promedio ponderado por unidades, o un costo de reposición que ustedes definan?</w:t>
+        <w:t>¿Es el mismo concepto que el costo unitario que figura en las órdenes de compra? Si no lo es, ¿en qué se diferencian?</w:t>
+      </w:r>
+    </w:p>
+    <w:p>
+      <w:pPr>
+        <w:spacing w:after="160"/>
+      </w:pPr>
+      <w:r>
+        <w:rPr>
+          <w:i/>
+          <w:color w:val="808080"/>
+        </w:rPr>
+        <w:t xml:space="preserve">Respuesta: </w:t>
+      </w:r>
+      <w:r>
+        <w:rPr>
+          <w:color w:val="BFBFBF"/>
+        </w:rPr>
+        <w:t>______________________________________________________________________________</w:t>
       </w:r>
     </w:p>
     <w:p>
@@ -448,31 +541,97 @@
         <w:rPr>
           <w:b/>
         </w:rPr>
-        <w:t>¿Pueden entregar directamente el costo de estos 22 SKUs desde el sistema de Compras? Es la opción preferible: evita cualquier estimación.</w:t>
+        <w:t>¿De qué fuente debemos tomar el costo de estos 22 productos?</w:t>
       </w:r>
     </w:p>
     <w:p>
       <w:pPr>
-        <w:spacing w:after="80"/>
+        <w:spacing w:after="160"/>
+      </w:pPr>
+      <w:r>
+        <w:rPr>
+          <w:i/>
+          <w:color w:val="808080"/>
+        </w:rPr>
+        <w:t xml:space="preserve">Respuesta: </w:t>
+      </w:r>
+      <w:r>
+        <w:rPr>
+          <w:color w:val="BFBFBF"/>
+        </w:rPr>
+        <w:t>______________________________________________________________________________</w:t>
+      </w:r>
+    </w:p>
+    <w:p>
+      <w:pPr>
+        <w:spacing w:before="120" w:after="60"/>
       </w:pPr>
       <w:r>
         <w:rPr>
           <w:b/>
-          <w:i w:val="0"/>
+          <w:color w:val="C0392B"/>
         </w:rPr>
-        <w:t xml:space="preserve">Criterio provisorio si no hay respuesta: </w:t>
+        <w:t xml:space="preserve">P6. </w:t>
+      </w:r>
+      <w:r>
+        <w:rPr>
+          <w:b/>
+        </w:rPr>
+        <w:t>¿Quién puede entregarnos ese dato y en qué plazo?</w:t>
       </w:r>
     </w:p>
     <w:p>
       <w:pPr>
-        <w:spacing w:after="200"/>
+        <w:spacing w:after="160"/>
       </w:pPr>
       <w:r>
         <w:rPr>
-          <w:b w:val="0"/>
-          <w:i w:val="0"/>
+          <w:i/>
+          <w:color w:val="808080"/>
         </w:rPr>
-        <w:t>se valúa con el costo promedio ponderado de las órdenes de compra de cada SKU y se marca la fila como costo estimado, para poder recalcular después. Con ese criterio el stock de estos SKUs vale $67,1 M a dic-2025.</w:t>
+        <w:t xml:space="preserve">Respuesta: </w:t>
+      </w:r>
+      <w:r>
+        <w:rPr>
+          <w:color w:val="BFBFBF"/>
+        </w:rPr>
+        <w:t>______________________________________________________________________________</w:t>
+      </w:r>
+    </w:p>
+    <w:p>
+      <w:pPr>
+        <w:spacing w:before="120" w:after="60"/>
+      </w:pPr>
+      <w:r>
+        <w:rPr>
+          <w:b/>
+          <w:color w:val="C0392B"/>
+        </w:rPr>
+        <w:t xml:space="preserve">P7. </w:t>
+      </w:r>
+      <w:r>
+        <w:rPr>
+          <w:b/>
+        </w:rPr>
+        <w:t>Mientras tanto, ¿cómo quieren que tratemos a estos 22 productos en los cálculos de capital inmovilizado y de margen?</w:t>
+      </w:r>
+    </w:p>
+    <w:p>
+      <w:pPr>
+        <w:spacing w:after="160"/>
+      </w:pPr>
+      <w:r>
+        <w:rPr>
+          <w:i/>
+          <w:color w:val="808080"/>
+        </w:rPr>
+        <w:t xml:space="preserve">Respuesta: </w:t>
+      </w:r>
+      <w:r>
+        <w:rPr>
+          <w:color w:val="BFBFBF"/>
+        </w:rPr>
+        <w:t>______________________________________________________________________________</w:t>
       </w:r>
     </w:p>
     <w:p>
@@ -484,7 +643,7 @@
           <w:b w:val="0"/>
           <w:i/>
         </w:rPr>
-        <w:t>Detalle de los 22 SKUs: archivo Entregable 2/EDA/resultados/skus_sin_costo.csv</w:t>
+        <w:t>Listado de los 22 productos: archivo adjunto “skus_sin_costo.csv”.</w:t>
       </w:r>
     </w:p>
     <w:p>
@@ -512,7 +671,7 @@
           <w:b/>
           <w:i w:val="0"/>
         </w:rPr>
-        <w:t>Qué se detectó</w:t>
+        <w:t>Qué encontramos en los datos</w:t>
       </w:r>
     </w:p>
     <w:p>
@@ -524,10 +683,10 @@
         <w:rPr>
           <w:b/>
         </w:rPr>
-        <w:t>40 filas de Historial_Precios_SKU.csv no tienen costo unitario</w:t>
+        <w:t>40 registros del historial de precios no tienen costo unitario</w:t>
       </w:r>
       <w:r>
-        <w:t>, y corresponden exactamente a los mismos 22 SKUs del Bloque 1.</w:t>
+        <w:t>, y corresponden exactamente a los mismos 22 productos del bloque anterior.</w:t>
       </w:r>
     </w:p>
     <w:p>
@@ -542,7 +701,7 @@
         <w:t xml:space="preserve">El vacío es total por producto: </w:t>
       </w:r>
       <w:r>
-        <w:t>ninguno de los 22 tiene costo en una vigencia y vacío en otra. O está en todas, o en ninguna.</w:t>
+        <w:t>ninguno de los 22 tiene costo cargado en una vigencia y vacío en otra.</w:t>
       </w:r>
     </w:p>
     <w:p>
@@ -554,7 +713,7 @@
         <w:rPr>
           <w:b/>
         </w:rPr>
-        <w:t>El precio de lista sí está cargado en las 40 filas.</w:t>
+        <w:t>En esos 40 registros el precio de lista sí está cargado.</w:t>
       </w:r>
       <w:r>
         <w:t xml:space="preserve"> Falta únicamente el costo.</w:t>
@@ -572,67 +731,22 @@
         <w:t xml:space="preserve">El resto del historial es consistente: </w:t>
       </w:r>
       <w:r>
-        <w:t>sin solapamientos ni huecos entre vigencias, la última vigencia coincide con el precio del catálogo en los 800 SKUs, y la primera coincide con la fecha de alta en los 800.</w:t>
+        <w:t>no hay vigencias solapadas ni períodos sin cubrir, la última vigencia de cada producto coincide con el precio del catálogo en los 800 casos, y la primera coincide con la fecha de alta en los 800.</w:t>
       </w:r>
     </w:p>
     <w:p>
       <w:pPr>
-        <w:spacing w:after="80"/>
+        <w:pStyle w:val="ListBullet"/>
+        <w:spacing w:after="40"/>
       </w:pPr>
       <w:r>
         <w:rPr>
           <w:b/>
-          <w:i w:val="0"/>
         </w:rPr>
-        <w:t>Por qué importa</w:t>
-      </w:r>
-    </w:p>
-    <w:p>
-      <w:pPr>
-        <w:spacing w:after="80"/>
-      </w:pPr>
-      <w:r>
-        <w:rPr>
-          <w:b w:val="0"/>
-          <w:i w:val="0"/>
-        </w:rPr>
-        <w:t>Confirma que el problema está en el alta del producto y no en el mantenimiento de precios: el costo nunca entró al sistema. También implica que no se puede reconstruir el costo histórico de estos SKUs, ni calcular su margen real en liquidaciones.</w:t>
-      </w:r>
-    </w:p>
-    <w:p>
-      <w:pPr>
-        <w:spacing w:before="120" w:after="60"/>
-      </w:pPr>
-      <w:r>
-        <w:rPr>
-          <w:b/>
-          <w:color w:val="C0392B"/>
-        </w:rPr>
-        <w:t xml:space="preserve">P6. </w:t>
+        <w:t xml:space="preserve">Entre una vigencia y la siguiente, </w:t>
       </w:r>
       <w:r>
-        <w:rPr>
-          <w:b/>
-        </w:rPr>
-        <w:t>¿Cuál es la fuente maestra del costo: el catálogo de productos o el historial de precios? ¿Cuál manda si difieren?</w:t>
-      </w:r>
-    </w:p>
-    <w:p>
-      <w:pPr>
-        <w:spacing w:before="120" w:after="60"/>
-      </w:pPr>
-      <w:r>
-        <w:rPr>
-          <w:b/>
-          <w:color w:val="C0392B"/>
-        </w:rPr>
-        <w:t xml:space="preserve">P7. </w:t>
-      </w:r>
-      <w:r>
-        <w:rPr>
-          <w:b/>
-        </w:rPr>
-        <w:t>¿El historial de precios se alimenta automáticamente del catálogo, o son cargas independientes? Lo preguntamos porque el vacío es idéntico en ambos, lo que sugiere una única fuente o una réplica.</w:t>
+        <w:t>el precio de lista sube 86% en la mediana, con casos de hasta 393%.</w:t>
       </w:r>
     </w:p>
     <w:p>
@@ -650,7 +764,25 @@
         <w:rPr>
           <w:b/>
         </w:rPr>
-        <w:t>Cuando un producto cambia de proveedor y de costo, ¿se registra una nueva vigencia en el historial o se pisa el valor anterior?</w:t>
+        <w:t>¿Cuál de los dos sistemas es la fuente maestra del costo: el catálogo de productos o el historial de precios? Si los valores difieren, ¿cuál debe prevalecer?</w:t>
+      </w:r>
+    </w:p>
+    <w:p>
+      <w:pPr>
+        <w:spacing w:after="160"/>
+      </w:pPr>
+      <w:r>
+        <w:rPr>
+          <w:i/>
+          <w:color w:val="808080"/>
+        </w:rPr>
+        <w:t xml:space="preserve">Respuesta: </w:t>
+      </w:r>
+      <w:r>
+        <w:rPr>
+          <w:color w:val="BFBFBF"/>
+        </w:rPr>
+        <w:t>______________________________________________________________________________</w:t>
       </w:r>
     </w:p>
     <w:p>
@@ -668,31 +800,169 @@
         <w:rPr>
           <w:b/>
         </w:rPr>
-        <w:t>Para los 15 SKUs que aparecen duplicados en el catálogo con dos proveedores distintos: ¿el costo debería ser uno por proveedor? Hoy el historial guarda un solo costo por SKU y por vigencia, así que el modelo de datos no contempla ese caso.</w:t>
+        <w:t>¿Cómo se alimenta el historial de precios? ¿Se genera a partir del catálogo o son cargas independientes?</w:t>
       </w:r>
     </w:p>
     <w:p>
       <w:pPr>
-        <w:spacing w:after="80"/>
+        <w:spacing w:after="160"/>
+      </w:pPr>
+      <w:r>
+        <w:rPr>
+          <w:i/>
+          <w:color w:val="808080"/>
+        </w:rPr>
+        <w:t xml:space="preserve">Respuesta: </w:t>
+      </w:r>
+      <w:r>
+        <w:rPr>
+          <w:color w:val="BFBFBF"/>
+        </w:rPr>
+        <w:t>______________________________________________________________________________</w:t>
+      </w:r>
+    </w:p>
+    <w:p>
+      <w:pPr>
+        <w:spacing w:before="120" w:after="60"/>
       </w:pPr>
       <w:r>
         <w:rPr>
           <w:b/>
-          <w:i w:val="0"/>
+          <w:color w:val="C0392B"/>
         </w:rPr>
-        <w:t>Observación adicional para validar</w:t>
+        <w:t xml:space="preserve">P10. </w:t>
+      </w:r>
+      <w:r>
+        <w:rPr>
+          <w:b/>
+        </w:rPr>
+        <w:t>Cuando cambia el costo de un producto, ¿qué se registra? ¿Se abre una vigencia nueva o se actualiza el valor existente?</w:t>
       </w:r>
     </w:p>
     <w:p>
       <w:pPr>
-        <w:spacing w:after="200"/>
+        <w:spacing w:after="160"/>
       </w:pPr>
       <w:r>
         <w:rPr>
-          <w:b w:val="0"/>
-          <w:i w:val="0"/>
+          <w:i/>
+          <w:color w:val="808080"/>
         </w:rPr>
-        <w:t>Entre vigencias consecutivas, el precio de lista sube 86% en la mediana y hasta 393%. Son saltos nominales grandes: hace falta confirmar si responden a la inflación del período, para decidir si el análisis se hace a precios corrientes o constantes.</w:t>
+        <w:t xml:space="preserve">Respuesta: </w:t>
+      </w:r>
+      <w:r>
+        <w:rPr>
+          <w:color w:val="BFBFBF"/>
+        </w:rPr>
+        <w:t>______________________________________________________________________________</w:t>
+      </w:r>
+    </w:p>
+    <w:p>
+      <w:pPr>
+        <w:spacing w:before="120" w:after="60"/>
+      </w:pPr>
+      <w:r>
+        <w:rPr>
+          <w:b/>
+          <w:color w:val="C0392B"/>
+        </w:rPr>
+        <w:t xml:space="preserve">P11. </w:t>
+      </w:r>
+      <w:r>
+        <w:rPr>
+          <w:b/>
+        </w:rPr>
+        <w:t>Cuando un producto se compra a más de un proveedor con costos distintos, ¿cómo se registra esa situación? Lo consultamos porque hay 15 productos que figuran en el catálogo con dos proveedores, y el historial guarda un único costo por producto y vigencia.</w:t>
+      </w:r>
+    </w:p>
+    <w:p>
+      <w:pPr>
+        <w:spacing w:after="160"/>
+      </w:pPr>
+      <w:r>
+        <w:rPr>
+          <w:i/>
+          <w:color w:val="808080"/>
+        </w:rPr>
+        <w:t xml:space="preserve">Respuesta: </w:t>
+      </w:r>
+      <w:r>
+        <w:rPr>
+          <w:color w:val="BFBFBF"/>
+        </w:rPr>
+        <w:t>______________________________________________________________________________</w:t>
+      </w:r>
+    </w:p>
+    <w:p>
+      <w:pPr>
+        <w:spacing w:before="120" w:after="60"/>
+      </w:pPr>
+      <w:r>
+        <w:rPr>
+          <w:b/>
+          <w:color w:val="C0392B"/>
+        </w:rPr>
+        <w:t xml:space="preserve">P12. </w:t>
+      </w:r>
+      <w:r>
+        <w:rPr>
+          <w:b/>
+        </w:rPr>
+        <w:t>¿A qué responden las variaciones de precio entre vigencias? ¿Siguen algún criterio de actualización definido?</w:t>
+      </w:r>
+    </w:p>
+    <w:p>
+      <w:pPr>
+        <w:spacing w:after="160"/>
+      </w:pPr>
+      <w:r>
+        <w:rPr>
+          <w:i/>
+          <w:color w:val="808080"/>
+        </w:rPr>
+        <w:t xml:space="preserve">Respuesta: </w:t>
+      </w:r>
+      <w:r>
+        <w:rPr>
+          <w:color w:val="BFBFBF"/>
+        </w:rPr>
+        <w:t>______________________________________________________________________________</w:t>
+      </w:r>
+    </w:p>
+    <w:p>
+      <w:pPr>
+        <w:spacing w:before="120" w:after="60"/>
+      </w:pPr>
+      <w:r>
+        <w:rPr>
+          <w:b/>
+          <w:color w:val="C0392B"/>
+        </w:rPr>
+        <w:t xml:space="preserve">P13. </w:t>
+      </w:r>
+      <w:r>
+        <w:rPr>
+          <w:b/>
+        </w:rPr>
+        <w:t>¿Los análisis de venta y de margen deben hacerse a precios corrientes de cada período, o hay una referencia que la empresa use para comparar valores entre años?</w:t>
+      </w:r>
+    </w:p>
+    <w:p>
+      <w:pPr>
+        <w:spacing w:after="160"/>
+      </w:pPr>
+      <w:r>
+        <w:rPr>
+          <w:i/>
+          <w:color w:val="808080"/>
+        </w:rPr>
+        <w:t xml:space="preserve">Respuesta: </w:t>
+      </w:r>
+      <w:r>
+        <w:rPr>
+          <w:color w:val="BFBFBF"/>
+        </w:rPr>
+        <w:t>______________________________________________________________________________</w:t>
       </w:r>
     </w:p>
     <w:p>
@@ -708,7 +978,7 @@
         <w:rPr>
           <w:color w:val="1F3A5F"/>
         </w:rPr>
-        <w:t>Bloque 3 · Valores imposibles detectados (5.854 registros)</w:t>
+        <w:t>Bloque 3 · Valores que no pueden existir por definición</w:t>
       </w:r>
     </w:p>
     <w:p>
@@ -720,7 +990,7 @@
           <w:b w:val="0"/>
           <w:i w:val="0"/>
         </w:rPr>
-        <w:t>Se agrupan acá todos los valores que no pueden existir por definición. No son valores extremos discutibles: son datos que contradicen la naturaleza de la variable.</w:t>
+        <w:t>Encontramos 5.854 registros con valores que contradicen la naturaleza de la variable. No son valores extremos discutibles: son datos imposibles, como un stock negativo.</w:t>
       </w:r>
     </w:p>
     <w:tbl>
@@ -850,7 +1120,7 @@
               <w:rPr>
                 <w:sz w:val="19"/>
               </w:rPr>
-              <w:t>Stock_SKU_tienda_mensual</w:t>
+              <w:t>Stock por SKU, tienda y mes</w:t>
             </w:r>
           </w:p>
         </w:tc>
@@ -908,7 +1178,7 @@
               <w:rPr>
                 <w:sz w:val="19"/>
               </w:rPr>
-              <w:t>Ventas_SKU_tienda_mensual</w:t>
+              <w:t>Ventas por SKU, tienda y mes</w:t>
             </w:r>
           </w:p>
         </w:tc>
@@ -966,7 +1236,7 @@
               <w:rPr>
                 <w:sz w:val="19"/>
               </w:rPr>
-              <w:t>Ventas_SKU_tienda_mensual</w:t>
+              <w:t>Ventas por SKU, tienda y mes</w:t>
             </w:r>
           </w:p>
         </w:tc>
@@ -982,7 +1252,7 @@
               <w:rPr>
                 <w:sz w:val="19"/>
               </w:rPr>
-              <w:t>Descuento fuera de 0-100%</w:t>
+              <w:t>Descuento fuera del rango 0-100%</w:t>
             </w:r>
           </w:p>
         </w:tc>
@@ -1040,7 +1310,7 @@
               <w:rPr>
                 <w:sz w:val="19"/>
               </w:rPr>
-              <w:t>Descuento fuera de 0-100%</w:t>
+              <w:t>Descuento fuera del rango 0-100%</w:t>
             </w:r>
           </w:p>
         </w:tc>
@@ -1082,7 +1352,7 @@
               <w:rPr>
                 <w:sz w:val="19"/>
               </w:rPr>
-              <w:t>Promociones_Comerciales</w:t>
+              <w:t>Promociones comerciales</w:t>
             </w:r>
           </w:p>
         </w:tc>
@@ -1140,7 +1410,7 @@
               <w:rPr>
                 <w:sz w:val="19"/>
               </w:rPr>
-              <w:t>Presupuesto_Ventas</w:t>
+              <w:t>Presupuesto de ventas</w:t>
             </w:r>
           </w:p>
         </w:tc>
@@ -1159,7 +1429,7 @@
         <w:rPr>
           <w:color w:val="1F3A5F"/>
         </w:rPr>
-        <w:t>3.1 Stock negativo (1.209 filas)</w:t>
+        <w:t>3.1 Stock disponible negativo (1.209 registros)</w:t>
       </w:r>
     </w:p>
     <w:p>
@@ -1171,7 +1441,7 @@
           <w:b/>
           <w:i w:val="0"/>
         </w:rPr>
-        <w:t>Qué encontramos</w:t>
+        <w:t>Qué encontramos en los datos</w:t>
       </w:r>
     </w:p>
     <w:p>
@@ -1186,7 +1456,7 @@
         <w:t xml:space="preserve">Está repartido, no concentrado: </w:t>
       </w:r>
       <w:r>
-        <w:t>548 SKUs, las 28 tiendas, 1.117 posiciones distintas. La tienda más afectada tiene 58 casos.</w:t>
+        <w:t>afecta a 548 productos, a las 28 tiendas y a 1.117 combinaciones distintas de producto y tienda.</w:t>
       </w:r>
     </w:p>
     <w:p>
@@ -1198,7 +1468,7 @@
         <w:rPr>
           <w:b/>
         </w:rPr>
-        <w:t xml:space="preserve">Crece con el negocio: </w:t>
+        <w:t xml:space="preserve">Aumenta a lo largo del tiempo: </w:t>
       </w:r>
       <w:r>
         <w:t>67 casos en 2022, 255 en 2023, 394 en 2024 y 493 en 2025.</w:t>
@@ -1213,10 +1483,10 @@
         <w:rPr>
           <w:b/>
         </w:rPr>
-        <w:t xml:space="preserve">Es chico en magnitud: </w:t>
+        <w:t xml:space="preserve">Los valores son chicos: </w:t>
       </w:r>
       <w:r>
-        <w:t>mediana −11 unidades; solo 5 filas superan las 100 unidades.</w:t>
+        <w:t>la mediana es de −11 unidades y solo 5 registros superan las 100 unidades.</w:t>
       </w:r>
     </w:p>
     <w:p>
@@ -1228,111 +1498,10 @@
         <w:rPr>
           <w:b/>
         </w:rPr>
-        <w:t xml:space="preserve">Respalda la explicación de sincronización POS-inventario que dio el negocio: </w:t>
+        <w:t>El 81,6% de esos registros tuvo ventas ese mismo mes</w:t>
       </w:r>
       <w:r>
-        <w:t>el 81,6% de esas filas tuvo ventas ese mes, el faltante se correlaciona con las unidades vendidas (0,75) y en 1.148 de 1.209 casos el mes siguiente vuelve a stock positivo.</w:t>
-      </w:r>
-    </w:p>
-    <w:p>
-      <w:pPr>
-        <w:spacing w:before="120" w:after="60"/>
-      </w:pPr>
-      <w:r>
-        <w:rPr>
-          <w:b/>
-          <w:color w:val="C0392B"/>
-        </w:rPr>
-        <w:t xml:space="preserve">P10. </w:t>
-      </w:r>
-      <w:r>
-        <w:rPr>
-          <w:b/>
-        </w:rPr>
-        <w:t>¿Confirman que el stock negativo es un desfasaje de sincronización entre el POS y el sistema de inventario, y no un ajuste de inventario real?</w:t>
-      </w:r>
-    </w:p>
-    <w:p>
-      <w:pPr>
-        <w:spacing w:before="120" w:after="60"/>
-      </w:pPr>
-      <w:r>
-        <w:rPr>
-          <w:b/>
-          <w:color w:val="C0392B"/>
-        </w:rPr>
-        <w:t xml:space="preserve">P11. </w:t>
-      </w:r>
-      <w:r>
-        <w:rPr>
-          <w:b/>
-        </w:rPr>
-        <w:t>¿Llevarlo a cero es el tratamiento correcto, o prefieren que lo reconstruyamos como “stock inicial menos ventas” del mes?</w:t>
-      </w:r>
-    </w:p>
-    <w:p>
-      <w:pPr>
-        <w:spacing w:before="120" w:after="60"/>
-      </w:pPr>
-      <w:r>
-        <w:rPr>
-          <w:b/>
-          <w:color w:val="C0392B"/>
-        </w:rPr>
-        <w:t xml:space="preserve">P12. </w:t>
-      </w:r>
-      <w:r>
-        <w:rPr>
-          <w:b/>
-        </w:rPr>
-        <w:t>¿Hay algún proceso de conteo o ajuste que corrija estos casos más adelante? Si existe, ¿podemos recibir esos ajustes?</w:t>
-      </w:r>
-    </w:p>
-    <w:p>
-      <w:pPr>
-        <w:spacing w:after="80"/>
-      </w:pPr>
-      <w:r>
-        <w:rPr>
-          <w:b/>
-          <w:i w:val="0"/>
-        </w:rPr>
-        <w:t xml:space="preserve">Criterio provisorio: </w:t>
-      </w:r>
-    </w:p>
-    <w:p>
-      <w:pPr>
-        <w:spacing w:after="160"/>
-      </w:pPr>
-      <w:r>
-        <w:rPr>
-          <w:b w:val="0"/>
-          <w:i w:val="0"/>
-        </w:rPr>
-        <w:t>se lleva a 0 y se marca la fila con una columna de auditoría. Impacto acotado: son 20.914 unidades sobre un stock que a dic-2025 es de 135.484.</w:t>
-      </w:r>
-    </w:p>
-    <w:p>
-      <w:pPr>
-        <w:pStyle w:val="Heading2"/>
-      </w:pPr>
-      <w:r>
-        <w:rPr>
-          <w:color w:val="1F3A5F"/>
-        </w:rPr>
-        <w:t>3.2 Unidades y venta neta negativas (2.317 filas)</w:t>
-      </w:r>
-    </w:p>
-    <w:p>
-      <w:pPr>
-        <w:spacing w:after="80"/>
-      </w:pPr>
-      <w:r>
-        <w:rPr>
-          <w:b/>
-          <w:i w:val="0"/>
-        </w:rPr>
-        <w:t>Qué encontramos</w:t>
+        <w:t xml:space="preserve"> y el tamaño del faltante acompaña a las unidades vendidas.</w:t>
       </w:r>
     </w:p>
     <w:p>
@@ -1344,73 +1513,10 @@
         <w:rPr>
           <w:b/>
         </w:rPr>
-        <w:t xml:space="preserve">Son exactamente las devoluciones. </w:t>
+        <w:t xml:space="preserve">En 1.148 de los 1.209 casos, </w:t>
       </w:r>
       <w:r>
-        <w:t>Las 2.317 filas negativas coinciden una a una con los 2.317 registros de Devoluciones_SKU.csv: misma tienda, mismo SKU, mismo mes y las mismas unidades. Ya no es una hipótesis.</w:t>
-      </w:r>
-    </w:p>
-    <w:p>
-      <w:pPr>
-        <w:pStyle w:val="ListBullet"/>
-        <w:spacing w:after="40"/>
-      </w:pPr>
-      <w:r>
-        <w:rPr>
-          <w:b/>
-        </w:rPr>
-        <w:t xml:space="preserve">Pesan poco: </w:t>
-      </w:r>
-      <w:r>
-        <w:t>9.583 unidades, el 1,27% de las unidades vendidas; $418,3 M en valor absoluto.</w:t>
-      </w:r>
-    </w:p>
-    <w:p>
-      <w:pPr>
-        <w:pStyle w:val="ListBullet"/>
-        <w:spacing w:after="40"/>
-      </w:pPr>
-      <w:r>
-        <w:rPr>
-          <w:b/>
-        </w:rPr>
-        <w:t xml:space="preserve">Pero los motivos no coinciden con lo que se nos informó. </w:t>
-      </w:r>
-      <w:r>
-        <w:t>En el Entregable 1 el negocio indicó que eran “mayormente devoluciones de clientes”. En el dataset solo 466 de 2.317 (20%) son “Devolución de cliente (cambio)”. El resto es producto dañado en logística (499), producto sin rotación / no vendido (471), error de picking (446) y defecto de fabricación (435).</w:t>
-      </w:r>
-    </w:p>
-    <w:p>
-      <w:pPr>
-        <w:pStyle w:val="ListBullet"/>
-        <w:spacing w:after="40"/>
-      </w:pPr>
-      <w:r>
-        <w:rPr>
-          <w:b/>
-        </w:rPr>
-        <w:t xml:space="preserve">En solo 40 de los 2.317 casos </w:t>
-      </w:r>
-      <w:r>
-        <w:t>hay además una fila de venta positiva del mismo producto, tienda y mes.</w:t>
-      </w:r>
-    </w:p>
-    <w:p>
-      <w:pPr>
-        <w:spacing w:before="120" w:after="60"/>
-      </w:pPr>
-      <w:r>
-        <w:rPr>
-          <w:b/>
-          <w:color w:val="C0392B"/>
-        </w:rPr>
-        <w:t xml:space="preserve">P13. </w:t>
-      </w:r>
-      <w:r>
-        <w:rPr>
-          <w:b/>
-        </w:rPr>
-        <w:t>El dataset de devoluciones muestra que solo el 20% son devoluciones de clientes. ¿Los otros cuatro motivos (daño en logística, error de picking, defecto de fábrica, producto sin rotación) también se registran como venta negativa en el POS, o deberían ser movimientos de inventario?</w:t>
+        <w:t>el mes siguiente esa misma combinación vuelve a tener stock positivo.</w:t>
       </w:r>
     </w:p>
     <w:p>
@@ -1428,7 +1534,25 @@
         <w:rPr>
           <w:b/>
         </w:rPr>
-        <w:t>“Producto sin rotación / no vendido” (471 registros, 2.013 unidades) — ¿qué operación representa? ¿Es una devolución al proveedor? Es directamente relevante para el proyecto: si se puede devolver mercadería sin rotación, es una palanca de acción que hoy no estamos contemplando.</w:t>
+        <w:t>¿Qué representa un stock negativo en el reporte? ¿A qué situación operativa corresponde?</w:t>
+      </w:r>
+    </w:p>
+    <w:p>
+      <w:pPr>
+        <w:spacing w:after="160"/>
+      </w:pPr>
+      <w:r>
+        <w:rPr>
+          <w:i/>
+          <w:color w:val="808080"/>
+        </w:rPr>
+        <w:t xml:space="preserve">Respuesta: </w:t>
+      </w:r>
+      <w:r>
+        <w:rPr>
+          <w:color w:val="BFBFBF"/>
+        </w:rPr>
+        <w:t>______________________________________________________________________________</w:t>
       </w:r>
     </w:p>
     <w:p>
@@ -1446,7 +1570,25 @@
         <w:rPr>
           <w:b/>
         </w:rPr>
-        <w:t>¿La venta neta ya tiene descontadas las devoluciones, o hay que restarlas aparte? Con la coincidencia uno a uno, la lectura es que la devolución está cargada como una fila negativa separada.</w:t>
+        <w:t>¿Existe algún proceso de conteo o ajuste posterior que corrija estos casos? Si existe, ¿podemos recibir esos ajustes?</w:t>
+      </w:r>
+    </w:p>
+    <w:p>
+      <w:pPr>
+        <w:spacing w:after="160"/>
+      </w:pPr>
+      <w:r>
+        <w:rPr>
+          <w:i/>
+          <w:color w:val="808080"/>
+        </w:rPr>
+        <w:t xml:space="preserve">Respuesta: </w:t>
+      </w:r>
+      <w:r>
+        <w:rPr>
+          <w:color w:val="BFBFBF"/>
+        </w:rPr>
+        <w:t>______________________________________________________________________________</w:t>
       </w:r>
     </w:p>
     <w:p>
@@ -1464,7 +1606,72 @@
         <w:rPr>
           <w:b/>
         </w:rPr>
-        <w:t>Para el modelo: cuando un producto se devuelve por daño o defecto, ¿la unidad vuelve al stock vendible de la tienda o se da de baja?</w:t>
+        <w:t>¿Cómo quieren que tratemos estos registros en el análisis?</w:t>
+      </w:r>
+    </w:p>
+    <w:p>
+      <w:pPr>
+        <w:spacing w:after="160"/>
+      </w:pPr>
+      <w:r>
+        <w:rPr>
+          <w:i/>
+          <w:color w:val="808080"/>
+        </w:rPr>
+        <w:t xml:space="preserve">Respuesta: </w:t>
+      </w:r>
+      <w:r>
+        <w:rPr>
+          <w:color w:val="BFBFBF"/>
+        </w:rPr>
+        <w:t>______________________________________________________________________________</w:t>
+      </w:r>
+    </w:p>
+    <w:p>
+      <w:pPr>
+        <w:spacing w:before="120" w:after="60"/>
+      </w:pPr>
+      <w:r>
+        <w:rPr>
+          <w:b/>
+          <w:color w:val="C0392B"/>
+        </w:rPr>
+        <w:t xml:space="preserve">P17. </w:t>
+      </w:r>
+      <w:r>
+        <w:rPr>
+          <w:b/>
+        </w:rPr>
+        <w:t>¿Hay algún control previsto para evitar que el stock quede en negativo?</w:t>
+      </w:r>
+    </w:p>
+    <w:p>
+      <w:pPr>
+        <w:spacing w:after="160"/>
+      </w:pPr>
+      <w:r>
+        <w:rPr>
+          <w:i/>
+          <w:color w:val="808080"/>
+        </w:rPr>
+        <w:t xml:space="preserve">Respuesta: </w:t>
+      </w:r>
+      <w:r>
+        <w:rPr>
+          <w:color w:val="BFBFBF"/>
+        </w:rPr>
+        <w:t>______________________________________________________________________________</w:t>
+      </w:r>
+    </w:p>
+    <w:p>
+      <w:pPr>
+        <w:pStyle w:val="Heading2"/>
+      </w:pPr>
+      <w:r>
+        <w:rPr>
+          <w:color w:val="1F3A5F"/>
+        </w:rPr>
+        <w:t>3.2 Unidades y venta neta negativas (2.317 registros)</w:t>
       </w:r>
     </w:p>
     <w:p>
@@ -1476,7 +1683,85 @@
           <w:b/>
           <w:i w:val="0"/>
         </w:rPr>
-        <w:t xml:space="preserve">Criterio provisorio: </w:t>
+        <w:t>Qué encontramos en los datos</w:t>
+      </w:r>
+    </w:p>
+    <w:p>
+      <w:pPr>
+        <w:pStyle w:val="ListBullet"/>
+        <w:spacing w:after="40"/>
+      </w:pPr>
+      <w:r>
+        <w:rPr>
+          <w:b/>
+        </w:rPr>
+        <w:t>Los 2.317 registros negativos de venta coinciden uno a uno con los 2.317 registros del dataset de devoluciones</w:t>
+      </w:r>
+      <w:r>
+        <w:t>: misma tienda, mismo producto, mismo mes y las mismas unidades.</w:t>
+      </w:r>
+    </w:p>
+    <w:p>
+      <w:pPr>
+        <w:pStyle w:val="ListBullet"/>
+        <w:spacing w:after="40"/>
+      </w:pPr>
+      <w:r>
+        <w:rPr>
+          <w:b/>
+        </w:rPr>
+        <w:t xml:space="preserve">Representan 9.583 unidades, </w:t>
+      </w:r>
+      <w:r>
+        <w:t>el 1,27% de las unidades vendidas en el período.</w:t>
+      </w:r>
+    </w:p>
+    <w:p>
+      <w:pPr>
+        <w:pStyle w:val="ListBullet"/>
+        <w:spacing w:after="40"/>
+      </w:pPr>
+      <w:r>
+        <w:rPr>
+          <w:b/>
+        </w:rPr>
+        <w:t xml:space="preserve">Por motivo de devolución: </w:t>
+      </w:r>
+      <w:r>
+        <w:t>producto dañado en logística 499 casos, producto sin rotación o no vendido 471, devolución de cliente por cambio 466, error de picking 446 y defecto de fabricación 435.</w:t>
+      </w:r>
+    </w:p>
+    <w:p>
+      <w:pPr>
+        <w:pStyle w:val="ListBullet"/>
+        <w:spacing w:after="40"/>
+      </w:pPr>
+      <w:r>
+        <w:rPr>
+          <w:b/>
+        </w:rPr>
+        <w:t xml:space="preserve">En solo 40 de los 2.317 casos </w:t>
+      </w:r>
+      <w:r>
+        <w:t>existe además un registro de venta positiva del mismo producto, tienda y mes.</w:t>
+      </w:r>
+    </w:p>
+    <w:p>
+      <w:pPr>
+        <w:spacing w:before="120" w:after="60"/>
+      </w:pPr>
+      <w:r>
+        <w:rPr>
+          <w:b/>
+          <w:color w:val="C0392B"/>
+        </w:rPr>
+        <w:t xml:space="preserve">P18. </w:t>
+      </w:r>
+      <w:r>
+        <w:rPr>
+          <w:b/>
+        </w:rPr>
+        <w:t>¿Qué operación hay detrás de cada uno de los cinco motivos de devolución? Nos interesa entender en particular qué significa “producto sin rotación / no vendido”.</w:t>
       </w:r>
     </w:p>
     <w:p>
@@ -1485,10 +1770,196 @@
       </w:pPr>
       <w:r>
         <w:rPr>
-          <w:b w:val="0"/>
-          <w:i w:val="0"/>
+          <w:i/>
+          <w:color w:val="808080"/>
         </w:rPr>
-        <w:t>se dejan de llevar a cero. Se separan como devoluciones y se netean de la venta del mes para calcular el ritmo de rotación, conservando el motivo como variable.</w:t>
+        <w:t xml:space="preserve">Respuesta: </w:t>
+      </w:r>
+      <w:r>
+        <w:rPr>
+          <w:color w:val="BFBFBF"/>
+        </w:rPr>
+        <w:t>______________________________________________________________________________</w:t>
+      </w:r>
+    </w:p>
+    <w:p>
+      <w:pPr>
+        <w:spacing w:before="120" w:after="60"/>
+      </w:pPr>
+      <w:r>
+        <w:rPr>
+          <w:b/>
+          <w:color w:val="C0392B"/>
+        </w:rPr>
+        <w:t xml:space="preserve">P19. </w:t>
+      </w:r>
+      <w:r>
+        <w:rPr>
+          <w:b/>
+        </w:rPr>
+        <w:t>¿Todos esos motivos se registran como una venta negativa en el sistema, o algunos deberían ser movimientos de inventario?</w:t>
+      </w:r>
+    </w:p>
+    <w:p>
+      <w:pPr>
+        <w:spacing w:after="160"/>
+      </w:pPr>
+      <w:r>
+        <w:rPr>
+          <w:i/>
+          <w:color w:val="808080"/>
+        </w:rPr>
+        <w:t xml:space="preserve">Respuesta: </w:t>
+      </w:r>
+      <w:r>
+        <w:rPr>
+          <w:color w:val="BFBFBF"/>
+        </w:rPr>
+        <w:t>______________________________________________________________________________</w:t>
+      </w:r>
+    </w:p>
+    <w:p>
+      <w:pPr>
+        <w:spacing w:before="120" w:after="60"/>
+      </w:pPr>
+      <w:r>
+        <w:rPr>
+          <w:b/>
+          <w:color w:val="C0392B"/>
+        </w:rPr>
+        <w:t xml:space="preserve">P20. </w:t>
+      </w:r>
+      <w:r>
+        <w:rPr>
+          <w:b/>
+        </w:rPr>
+        <w:t>¿La venta neta que figura en el reporte ya tiene descontadas las devoluciones, o el reporte las presenta como un registro separado?</w:t>
+      </w:r>
+    </w:p>
+    <w:p>
+      <w:pPr>
+        <w:spacing w:after="160"/>
+      </w:pPr>
+      <w:r>
+        <w:rPr>
+          <w:i/>
+          <w:color w:val="808080"/>
+        </w:rPr>
+        <w:t xml:space="preserve">Respuesta: </w:t>
+      </w:r>
+      <w:r>
+        <w:rPr>
+          <w:color w:val="BFBFBF"/>
+        </w:rPr>
+        <w:t>______________________________________________________________________________</w:t>
+      </w:r>
+    </w:p>
+    <w:p>
+      <w:pPr>
+        <w:spacing w:before="120" w:after="60"/>
+      </w:pPr>
+      <w:r>
+        <w:rPr>
+          <w:b/>
+          <w:color w:val="C0392B"/>
+        </w:rPr>
+        <w:t xml:space="preserve">P21. </w:t>
+      </w:r>
+      <w:r>
+        <w:rPr>
+          <w:b/>
+        </w:rPr>
+        <w:t>Cuando se devuelve una unidad, ¿qué sucede físicamente con ella? ¿Vuelve al stock vendible de la tienda, se da de baja o se devuelve al proveedor?</w:t>
+      </w:r>
+    </w:p>
+    <w:p>
+      <w:pPr>
+        <w:spacing w:after="160"/>
+      </w:pPr>
+      <w:r>
+        <w:rPr>
+          <w:i/>
+          <w:color w:val="808080"/>
+        </w:rPr>
+        <w:t xml:space="preserve">Respuesta: </w:t>
+      </w:r>
+      <w:r>
+        <w:rPr>
+          <w:color w:val="BFBFBF"/>
+        </w:rPr>
+        <w:t>______________________________________________________________________________</w:t>
+      </w:r>
+    </w:p>
+    <w:p>
+      <w:pPr>
+        <w:spacing w:before="120" w:after="60"/>
+      </w:pPr>
+      <w:r>
+        <w:rPr>
+          <w:b/>
+          <w:color w:val="C0392B"/>
+        </w:rPr>
+        <w:t xml:space="preserve">P22. </w:t>
+      </w:r>
+      <w:r>
+        <w:rPr>
+          <w:b/>
+        </w:rPr>
+        <w:t>¿Existe la posibilidad de devolverle mercadería sin rotación al proveedor? Si existe, ¿bajo qué condiciones y con qué proveedores?</w:t>
+      </w:r>
+    </w:p>
+    <w:p>
+      <w:pPr>
+        <w:spacing w:after="160"/>
+      </w:pPr>
+      <w:r>
+        <w:rPr>
+          <w:i/>
+          <w:color w:val="808080"/>
+        </w:rPr>
+        <w:t xml:space="preserve">Respuesta: </w:t>
+      </w:r>
+      <w:r>
+        <w:rPr>
+          <w:color w:val="BFBFBF"/>
+        </w:rPr>
+        <w:t>______________________________________________________________________________</w:t>
+      </w:r>
+    </w:p>
+    <w:p>
+      <w:pPr>
+        <w:spacing w:before="120" w:after="60"/>
+      </w:pPr>
+      <w:r>
+        <w:rPr>
+          <w:b/>
+          <w:color w:val="C0392B"/>
+        </w:rPr>
+        <w:t xml:space="preserve">P23. </w:t>
+      </w:r>
+      <w:r>
+        <w:rPr>
+          <w:b/>
+        </w:rPr>
+        <w:t>¿Cómo quieren que tratemos estos registros al calcular el ritmo de venta de cada producto?</w:t>
+      </w:r>
+    </w:p>
+    <w:p>
+      <w:pPr>
+        <w:spacing w:after="160"/>
+      </w:pPr>
+      <w:r>
+        <w:rPr>
+          <w:i/>
+          <w:color w:val="808080"/>
+        </w:rPr>
+        <w:t xml:space="preserve">Respuesta: </w:t>
+      </w:r>
+      <w:r>
+        <w:rPr>
+          <w:color w:val="BFBFBF"/>
+        </w:rPr>
+        <w:t>______________________________________________________________________________</w:t>
       </w:r>
     </w:p>
     <w:p>
@@ -1499,7 +1970,7 @@
         <w:rPr>
           <w:color w:val="1F3A5F"/>
         </w:rPr>
-        <w:t>3.3 Descuentos fuera de rango (5 registros)</w:t>
+        <w:t>3.3 Descuentos fuera del rango 0-100% (5 registros)</w:t>
       </w:r>
     </w:p>
     <w:tbl>
@@ -2050,22 +2521,10 @@
       </w:pPr>
       <w:r>
         <w:rPr>
-          <w:b/>
-          <w:i w:val="0"/>
-        </w:rPr>
-        <w:t xml:space="preserve">Contexto útil: </w:t>
-      </w:r>
-    </w:p>
-    <w:p>
-      <w:pPr>
-        <w:spacing w:after="80"/>
-      </w:pPr>
-      <w:r>
-        <w:rPr>
           <w:b w:val="0"/>
           <w:i w:val="0"/>
         </w:rPr>
-        <w:t>el resto de los descuentos usa solo valores redondos. En liquidaciones son 10, 15, 20, 25, 30, 40 y 50%. En promociones, de 5 a 40%. Los cinco casos son los únicos fuera de ese patrón, lo que sugiere error de carga y no una política excepcional.</w:t>
+        <w:t>Dato de contexto: el resto de los descuentos toma solo valores redondos. En liquidaciones, de 10% a 50%; en promociones, de 5% a 40%.</w:t>
       </w:r>
     </w:p>
     <w:p>
@@ -2077,13 +2536,31 @@
           <w:b/>
           <w:color w:val="C0392B"/>
         </w:rPr>
-        <w:t xml:space="preserve">P17. </w:t>
+        <w:t xml:space="preserve">P24. </w:t>
       </w:r>
       <w:r>
         <w:rPr>
           <w:b/>
         </w:rPr>
-        <w:t>Los dos descuentos de 120% y el de 150%: ¿son errores de tipeo (por ejemplo 20% y 50%), o hubo alguna acción de bonificación total? Un descuento mayor a 100% implicaría pagarle al cliente por llevarse el producto.</w:t>
+        <w:t>¿Qué significa un descuento de 120% o de 150%? ¿Corresponde a algún tipo de acción comercial?</w:t>
+      </w:r>
+    </w:p>
+    <w:p>
+      <w:pPr>
+        <w:spacing w:after="160"/>
+      </w:pPr>
+      <w:r>
+        <w:rPr>
+          <w:i/>
+          <w:color w:val="808080"/>
+        </w:rPr>
+        <w:t xml:space="preserve">Respuesta: </w:t>
+      </w:r>
+      <w:r>
+        <w:rPr>
+          <w:color w:val="BFBFBF"/>
+        </w:rPr>
+        <w:t>______________________________________________________________________________</w:t>
       </w:r>
     </w:p>
     <w:p>
@@ -2095,13 +2572,31 @@
           <w:b/>
           <w:color w:val="C0392B"/>
         </w:rPr>
-        <w:t xml:space="preserve">P18. </w:t>
+        <w:t xml:space="preserve">P25. </w:t>
       </w:r>
       <w:r>
         <w:rPr>
           <w:b/>
         </w:rPr>
-        <w:t>Los descuentos negativos (−10% y −15%): ¿significan un recargo, o son también un error de carga?</w:t>
+        <w:t>¿Y un descuento negativo, como −10% o −15%?</w:t>
+      </w:r>
+    </w:p>
+    <w:p>
+      <w:pPr>
+        <w:spacing w:after="160"/>
+      </w:pPr>
+      <w:r>
+        <w:rPr>
+          <w:i/>
+          <w:color w:val="808080"/>
+        </w:rPr>
+        <w:t xml:space="preserve">Respuesta: </w:t>
+      </w:r>
+      <w:r>
+        <w:rPr>
+          <w:color w:val="BFBFBF"/>
+        </w:rPr>
+        <w:t>______________________________________________________________________________</w:t>
       </w:r>
     </w:p>
     <w:p>
@@ -2113,25 +2608,13 @@
           <w:b/>
           <w:color w:val="C0392B"/>
         </w:rPr>
-        <w:t xml:space="preserve">P19. </w:t>
+        <w:t xml:space="preserve">P26. </w:t>
       </w:r>
       <w:r>
         <w:rPr>
           <w:b/>
         </w:rPr>
-        <w:t>¿El sistema valida el rango del descuento al cargarlo? Si no lo valida, conviene incluirlo en el plan de mejora de calidad de datos.</w:t>
-      </w:r>
-    </w:p>
-    <w:p>
-      <w:pPr>
-        <w:spacing w:after="80"/>
-      </w:pPr>
-      <w:r>
-        <w:rPr>
-          <w:b/>
-          <w:i w:val="0"/>
-        </w:rPr>
-        <w:t xml:space="preserve">Criterio provisorio: </w:t>
+        <w:t>¿Cuál es el rango válido de descuento según la política comercial? ¿Quién lo autoriza?</w:t>
       </w:r>
     </w:p>
     <w:p>
@@ -2140,10 +2623,88 @@
       </w:pPr>
       <w:r>
         <w:rPr>
-          <w:b w:val="0"/>
-          <w:i w:val="0"/>
+          <w:i/>
+          <w:color w:val="808080"/>
         </w:rPr>
-        <w:t>se excluyen los 5 registros de los cálculos de margen y se marcan, en lugar de acotarlos a 0-100% como se hizo en el Entregable 1. Acotar inventa un valor que nadie confirmó.</w:t>
+        <w:t xml:space="preserve">Respuesta: </w:t>
+      </w:r>
+      <w:r>
+        <w:rPr>
+          <w:color w:val="BFBFBF"/>
+        </w:rPr>
+        <w:t>______________________________________________________________________________</w:t>
+      </w:r>
+    </w:p>
+    <w:p>
+      <w:pPr>
+        <w:spacing w:before="120" w:after="60"/>
+      </w:pPr>
+      <w:r>
+        <w:rPr>
+          <w:b/>
+          <w:color w:val="C0392B"/>
+        </w:rPr>
+        <w:t xml:space="preserve">P27. </w:t>
+      </w:r>
+      <w:r>
+        <w:rPr>
+          <w:b/>
+        </w:rPr>
+        <w:t>¿El sistema valida el valor del descuento al momento de la carga?</w:t>
+      </w:r>
+    </w:p>
+    <w:p>
+      <w:pPr>
+        <w:spacing w:after="160"/>
+      </w:pPr>
+      <w:r>
+        <w:rPr>
+          <w:i/>
+          <w:color w:val="808080"/>
+        </w:rPr>
+        <w:t xml:space="preserve">Respuesta: </w:t>
+      </w:r>
+      <w:r>
+        <w:rPr>
+          <w:color w:val="BFBFBF"/>
+        </w:rPr>
+        <w:t>______________________________________________________________________________</w:t>
+      </w:r>
+    </w:p>
+    <w:p>
+      <w:pPr>
+        <w:spacing w:before="120" w:after="60"/>
+      </w:pPr>
+      <w:r>
+        <w:rPr>
+          <w:b/>
+          <w:color w:val="C0392B"/>
+        </w:rPr>
+        <w:t xml:space="preserve">P28. </w:t>
+      </w:r>
+      <w:r>
+        <w:rPr>
+          <w:b/>
+        </w:rPr>
+        <w:t>¿Cómo quieren que tratemos estos 5 registros en el análisis de margen?</w:t>
+      </w:r>
+    </w:p>
+    <w:p>
+      <w:pPr>
+        <w:spacing w:after="160"/>
+      </w:pPr>
+      <w:r>
+        <w:rPr>
+          <w:i/>
+          <w:color w:val="808080"/>
+        </w:rPr>
+        <w:t xml:space="preserve">Respuesta: </w:t>
+      </w:r>
+      <w:r>
+        <w:rPr>
+          <w:color w:val="BFBFBF"/>
+        </w:rPr>
+        <w:t>______________________________________________________________________________</w:t>
       </w:r>
     </w:p>
     <w:p>
@@ -2154,7 +2715,7 @@
         <w:rPr>
           <w:color w:val="1F3A5F"/>
         </w:rPr>
-        <w:t>3.4 Presupuesto negativo (6 valores en 5 filas)</w:t>
+        <w:t>3.4 Presupuesto con valores negativos o en cero</w:t>
       </w:r>
     </w:p>
     <w:tbl>
@@ -2619,22 +3180,10 @@
       </w:pPr>
       <w:r>
         <w:rPr>
-          <w:b/>
-          <w:i w:val="0"/>
-        </w:rPr>
-        <w:t xml:space="preserve">Se suma un caso relacionado: </w:t>
-      </w:r>
-    </w:p>
-    <w:p>
-      <w:pPr>
-        <w:spacing w:after="80"/>
-      </w:pPr>
-      <w:r>
-        <w:rPr>
           <w:b w:val="0"/>
           <w:i w:val="0"/>
         </w:rPr>
-        <w:t>309 celdas con presupuesto en cero, todas entre enero y mayo de 2022, en las 28 tiendas. El presupuesto promedio de una celda en 2022 es de $850.428, así que un cero no parece una meta real sino una carga pendiente.</w:t>
+        <w:t>Además hay 309 celdas con presupuesto en cero, todas entre enero y mayo de 2022 y repartidas en las 28 tiendas. Como referencia, el presupuesto promedio de una celda en 2022 es de $850.428.</w:t>
       </w:r>
     </w:p>
     <w:p>
@@ -2646,13 +3195,31 @@
           <w:b/>
           <w:color w:val="C0392B"/>
         </w:rPr>
-        <w:t xml:space="preserve">P20. </w:t>
+        <w:t xml:space="preserve">P29. </w:t>
       </w:r>
       <w:r>
         <w:rPr>
           <w:b/>
         </w:rPr>
-        <w:t>¿Un presupuesto negativo tiene algún significado (por ejemplo, un ajuste o una corrección contra un mes anterior), o son errores de carga?</w:t>
+        <w:t>¿Qué significa un presupuesto negativo? ¿Corresponde a un ajuste o corrección sobre otro período?</w:t>
+      </w:r>
+    </w:p>
+    <w:p>
+      <w:pPr>
+        <w:spacing w:after="160"/>
+      </w:pPr>
+      <w:r>
+        <w:rPr>
+          <w:i/>
+          <w:color w:val="808080"/>
+        </w:rPr>
+        <w:t xml:space="preserve">Respuesta: </w:t>
+      </w:r>
+      <w:r>
+        <w:rPr>
+          <w:color w:val="BFBFBF"/>
+        </w:rPr>
+        <w:t>______________________________________________________________________________</w:t>
       </w:r>
     </w:p>
     <w:p>
@@ -2664,13 +3231,31 @@
           <w:b/>
           <w:color w:val="C0392B"/>
         </w:rPr>
-        <w:t xml:space="preserve">P21. </w:t>
+        <w:t xml:space="preserve">P30. </w:t>
       </w:r>
       <w:r>
         <w:rPr>
           <w:b/>
         </w:rPr>
-        <w:t>Los 309 ceros de enero a mayo 2022: ¿son meses sin presupuesto asignado o es información que no llegó a cargarse? Cambia si los tomamos como meta cero o los excluimos del cálculo de cumplimiento.</w:t>
+        <w:t>¿Y un presupuesto en cero? ¿Significa que no se asignó meta para ese mes, o que el dato no llegó a cargarse?</w:t>
+      </w:r>
+    </w:p>
+    <w:p>
+      <w:pPr>
+        <w:spacing w:after="160"/>
+      </w:pPr>
+      <w:r>
+        <w:rPr>
+          <w:i/>
+          <w:color w:val="808080"/>
+        </w:rPr>
+        <w:t xml:space="preserve">Respuesta: </w:t>
+      </w:r>
+      <w:r>
+        <w:rPr>
+          <w:color w:val="BFBFBF"/>
+        </w:rPr>
+        <w:t>______________________________________________________________________________</w:t>
       </w:r>
     </w:p>
     <w:p>
@@ -2682,25 +3267,13 @@
           <w:b/>
           <w:color w:val="C0392B"/>
         </w:rPr>
-        <w:t xml:space="preserve">P22. </w:t>
+        <w:t xml:space="preserve">P31. </w:t>
       </w:r>
       <w:r>
         <w:rPr>
           <w:b/>
         </w:rPr>
-        <w:t>¿Cómo se arma el presupuesto y quién lo aprueba? Lo consultamos porque el cumplimiento da un valor casi idéntico —alrededor del 91%— en todos los años, categorías y tiendas, lo que es llamativamente parejo para una meta comercial.</w:t>
-      </w:r>
-    </w:p>
-    <w:p>
-      <w:pPr>
-        <w:spacing w:after="80"/>
-      </w:pPr>
-      <w:r>
-        <w:rPr>
-          <w:b/>
-          <w:i w:val="0"/>
-        </w:rPr>
-        <w:t xml:space="preserve">Criterio provisorio: </w:t>
+        <w:t>¿Cómo se construye el presupuesto de ventas y quién lo aprueba?</w:t>
       </w:r>
     </w:p>
     <w:p>
@@ -2709,10 +3282,52 @@
       </w:pPr>
       <w:r>
         <w:rPr>
-          <w:b w:val="0"/>
-          <w:i w:val="0"/>
+          <w:i/>
+          <w:color w:val="808080"/>
         </w:rPr>
-        <w:t>se excluyen las 5 filas negativas y los 309 ceros del cálculo de cumplimiento, y se documenta la exclusión.</w:t>
+        <w:t xml:space="preserve">Respuesta: </w:t>
+      </w:r>
+      <w:r>
+        <w:rPr>
+          <w:color w:val="BFBFBF"/>
+        </w:rPr>
+        <w:t>______________________________________________________________________________</w:t>
+      </w:r>
+    </w:p>
+    <w:p>
+      <w:pPr>
+        <w:spacing w:before="120" w:after="60"/>
+      </w:pPr>
+      <w:r>
+        <w:rPr>
+          <w:b/>
+          <w:color w:val="C0392B"/>
+        </w:rPr>
+        <w:t xml:space="preserve">P32. </w:t>
+      </w:r>
+      <w:r>
+        <w:rPr>
+          <w:b/>
+        </w:rPr>
+        <w:t>¿Cómo quieren que tratemos estos registros al medir el cumplimiento contra presupuesto?</w:t>
+      </w:r>
+    </w:p>
+    <w:p>
+      <w:pPr>
+        <w:spacing w:after="160"/>
+      </w:pPr>
+      <w:r>
+        <w:rPr>
+          <w:i/>
+          <w:color w:val="808080"/>
+        </w:rPr>
+        <w:t xml:space="preserve">Respuesta: </w:t>
+      </w:r>
+      <w:r>
+        <w:rPr>
+          <w:color w:val="BFBFBF"/>
+        </w:rPr>
+        <w:t>______________________________________________________________________________</w:t>
       </w:r>
     </w:p>
     <w:p>
@@ -2728,7 +3343,7 @@
         <w:rPr>
           <w:color w:val="1F3A5F"/>
         </w:rPr>
-        <w:t>Resumen de lo que necesitamos</w:t>
+        <w:t>Resumen de lo que necesitamos definir</w:t>
       </w:r>
     </w:p>
     <w:tbl>
@@ -2761,6 +3376,36 @@
         </w:tc>
         <w:tc>
           <w:tcPr>
+            <w:tcW w:type="dxa" w:w="1474"/>
+          </w:tcPr>
+          <w:p>
+            <w:r/>
+            <w:r>
+              <w:rPr>
+                <w:b/>
+                <w:sz w:val="19"/>
+              </w:rPr>
+              <w:t>Preguntas</w:t>
+            </w:r>
+          </w:p>
+        </w:tc>
+        <w:tc>
+          <w:tcPr>
+            <w:tcW w:type="dxa" w:w="2494"/>
+          </w:tcPr>
+          <w:p>
+            <w:r/>
+            <w:r>
+              <w:rPr>
+                <w:b/>
+                <w:sz w:val="19"/>
+              </w:rPr>
+              <w:t>Área que puede responder</w:t>
+            </w:r>
+          </w:p>
+        </w:tc>
+        <w:tc>
+          <w:tcPr>
             <w:tcW w:type="dxa" w:w="3628"/>
           </w:tcPr>
           <w:p>
@@ -2770,37 +3415,7 @@
                 <w:b/>
                 <w:sz w:val="19"/>
               </w:rPr>
-              <w:t>Qué pedimos</w:t>
-            </w:r>
-          </w:p>
-        </w:tc>
-        <w:tc>
-          <w:tcPr>
-            <w:tcW w:type="dxa" w:w="2041"/>
-          </w:tcPr>
-          <w:p>
-            <w:r/>
-            <w:r>
-              <w:rPr>
-                <w:b/>
-                <w:sz w:val="19"/>
-              </w:rPr>
-              <w:t>Responsable sugerido</w:t>
-            </w:r>
-          </w:p>
-        </w:tc>
-        <w:tc>
-          <w:tcPr>
-            <w:tcW w:type="dxa" w:w="1928"/>
-          </w:tcPr>
-          <w:p>
-            <w:r/>
-            <w:r>
-              <w:rPr>
-                <w:b/>
-                <w:sz w:val="19"/>
-              </w:rPr>
-              <w:t>Bloquea</w:t>
+              <w:t>Impacto si no se define</w:t>
             </w:r>
           </w:p>
         </w:tc>
@@ -2816,7 +3431,35 @@
               <w:rPr>
                 <w:sz w:val="19"/>
               </w:rPr>
-              <w:t>Costo de 22 SKUs</w:t>
+              <w:t>Costo de 22 productos</w:t>
+            </w:r>
+          </w:p>
+        </w:tc>
+        <w:tc>
+          <w:tcPr>
+            <w:tcW w:type="dxa" w:w="1474"/>
+          </w:tcPr>
+          <w:p>
+            <w:r/>
+            <w:r>
+              <w:rPr>
+                <w:sz w:val="19"/>
+              </w:rPr>
+              <w:t>P1 a P7</w:t>
+            </w:r>
+          </w:p>
+        </w:tc>
+        <w:tc>
+          <w:tcPr>
+            <w:tcW w:type="dxa" w:w="2494"/>
+          </w:tcPr>
+          <w:p>
+            <w:r/>
+            <w:r>
+              <w:rPr>
+                <w:sz w:val="19"/>
+              </w:rPr>
+              <w:t>Compras y Categorías · Finanzas</w:t>
             </w:r>
           </w:p>
         </w:tc>
@@ -2830,35 +3473,7 @@
               <w:rPr>
                 <w:sz w:val="19"/>
               </w:rPr>
-              <w:t>Costo unitario real desde el sistema de Compras, o confirmar que podemos usar el de las órdenes de compra</w:t>
-            </w:r>
-          </w:p>
-        </w:tc>
-        <w:tc>
-          <w:tcPr>
-            <w:tcW w:type="dxa" w:w="2041"/>
-          </w:tcPr>
-          <w:p>
-            <w:r/>
-            <w:r>
-              <w:rPr>
-                <w:sz w:val="19"/>
-              </w:rPr>
-              <w:t>Compras y Categorías · Finanzas</w:t>
-            </w:r>
-          </w:p>
-        </w:tc>
-        <w:tc>
-          <w:tcPr>
-            <w:tcW w:type="dxa" w:w="1928"/>
-          </w:tcPr>
-          <w:p>
-            <w:r/>
-            <w:r>
-              <w:rPr>
-                <w:sz w:val="19"/>
-              </w:rPr>
-              <w:t>Valuación del capital inmovilizado</w:t>
+              <w:t>No se puede valuar el capital inmovilizado de esos productos</w:t>
             </w:r>
           </w:p>
         </w:tc>
@@ -2874,7 +3489,35 @@
               <w:rPr>
                 <w:sz w:val="19"/>
               </w:rPr>
-              <w:t>Definición de costo</w:t>
+              <w:t>Fuente maestra del costo</w:t>
+            </w:r>
+          </w:p>
+        </w:tc>
+        <w:tc>
+          <w:tcPr>
+            <w:tcW w:type="dxa" w:w="1474"/>
+          </w:tcPr>
+          <w:p>
+            <w:r/>
+            <w:r>
+              <w:rPr>
+                <w:sz w:val="19"/>
+              </w:rPr>
+              <w:t>P8 a P13</w:t>
+            </w:r>
+          </w:p>
+        </w:tc>
+        <w:tc>
+          <w:tcPr>
+            <w:tcW w:type="dxa" w:w="2494"/>
+          </w:tcPr>
+          <w:p>
+            <w:r/>
+            <w:r>
+              <w:rPr>
+                <w:sz w:val="19"/>
+              </w:rPr>
+              <w:t>Finanzas · Sistemas</w:t>
             </w:r>
           </w:p>
         </w:tc>
@@ -2888,35 +3531,7 @@
               <w:rPr>
                 <w:sz w:val="19"/>
               </w:rPr>
-              <w:t>Si el costo del catálogo y el de la orden de compra son el mismo concepto</w:t>
-            </w:r>
-          </w:p>
-        </w:tc>
-        <w:tc>
-          <w:tcPr>
-            <w:tcW w:type="dxa" w:w="2041"/>
-          </w:tcPr>
-          <w:p>
-            <w:r/>
-            <w:r>
-              <w:rPr>
-                <w:sz w:val="19"/>
-              </w:rPr>
-              <w:t>Finanzas</w:t>
-            </w:r>
-          </w:p>
-        </w:tc>
-        <w:tc>
-          <w:tcPr>
-            <w:tcW w:type="dxa" w:w="1928"/>
-          </w:tcPr>
-          <w:p>
-            <w:r/>
-            <w:r>
-              <w:rPr>
-                <w:sz w:val="19"/>
-              </w:rPr>
-              <w:t>Cálculo de margen y de capital</w:t>
+              <w:t>Cálculo de margen y de capital a costo</w:t>
             </w:r>
           </w:p>
         </w:tc>
@@ -2938,7 +3553,7 @@
         </w:tc>
         <w:tc>
           <w:tcPr>
-            <w:tcW w:type="dxa" w:w="3628"/>
+            <w:tcW w:type="dxa" w:w="1474"/>
           </w:tcPr>
           <w:p>
             <w:r/>
@@ -2946,13 +3561,13 @@
               <w:rPr>
                 <w:sz w:val="19"/>
               </w:rPr>
-              <w:t>Confirmar el origen y el tratamiento</w:t>
+              <w:t>P14 a P17</w:t>
             </w:r>
           </w:p>
         </w:tc>
         <w:tc>
           <w:tcPr>
-            <w:tcW w:type="dxa" w:w="2041"/>
+            <w:tcW w:type="dxa" w:w="2494"/>
           </w:tcPr>
           <w:p>
             <w:r/>
@@ -2966,7 +3581,7 @@
         </w:tc>
         <w:tc>
           <w:tcPr>
-            <w:tcW w:type="dxa" w:w="1928"/>
+            <w:tcW w:type="dxa" w:w="3628"/>
           </w:tcPr>
           <w:p>
             <w:r/>
@@ -2974,7 +3589,7 @@
               <w:rPr>
                 <w:sz w:val="19"/>
               </w:rPr>
-              <w:t>Cálculo de cobertura</w:t>
+              <w:t>Cálculo de cobertura y de meses de stock</w:t>
             </w:r>
           </w:p>
         </w:tc>
@@ -2996,7 +3611,7 @@
         </w:tc>
         <w:tc>
           <w:tcPr>
-            <w:tcW w:type="dxa" w:w="3628"/>
+            <w:tcW w:type="dxa" w:w="1474"/>
           </w:tcPr>
           <w:p>
             <w:r/>
@@ -3004,13 +3619,13 @@
               <w:rPr>
                 <w:sz w:val="19"/>
               </w:rPr>
-              <w:t>Qué operación hay detrás de cada motivo y si la unidad vuelve al stock</w:t>
+              <w:t>P18 a P23</w:t>
             </w:r>
           </w:p>
         </w:tc>
         <w:tc>
           <w:tcPr>
-            <w:tcW w:type="dxa" w:w="2041"/>
+            <w:tcW w:type="dxa" w:w="2494"/>
           </w:tcPr>
           <w:p>
             <w:r/>
@@ -3024,7 +3639,7 @@
         </w:tc>
         <w:tc>
           <w:tcPr>
-            <w:tcW w:type="dxa" w:w="1928"/>
+            <w:tcW w:type="dxa" w:w="3628"/>
           </w:tcPr>
           <w:p>
             <w:r/>
@@ -3032,7 +3647,7 @@
               <w:rPr>
                 <w:sz w:val="19"/>
               </w:rPr>
-              <w:t>Variable objetivo del modelo</w:t>
+              <w:t>Definición de la variable que va a predecir el modelo</w:t>
             </w:r>
           </w:p>
         </w:tc>
@@ -3054,7 +3669,7 @@
         </w:tc>
         <w:tc>
           <w:tcPr>
-            <w:tcW w:type="dxa" w:w="3628"/>
+            <w:tcW w:type="dxa" w:w="1474"/>
           </w:tcPr>
           <w:p>
             <w:r/>
@@ -3062,13 +3677,13 @@
               <w:rPr>
                 <w:sz w:val="19"/>
               </w:rPr>
-              <w:t>Confirmar si son errores de carga</w:t>
+              <w:t>P24 a P28</w:t>
             </w:r>
           </w:p>
         </w:tc>
         <w:tc>
           <w:tcPr>
-            <w:tcW w:type="dxa" w:w="2041"/>
+            <w:tcW w:type="dxa" w:w="2494"/>
           </w:tcPr>
           <w:p>
             <w:r/>
@@ -3082,7 +3697,7 @@
         </w:tc>
         <w:tc>
           <w:tcPr>
-            <w:tcW w:type="dxa" w:w="1928"/>
+            <w:tcW w:type="dxa" w:w="3628"/>
           </w:tcPr>
           <w:p>
             <w:r/>
@@ -3090,7 +3705,7 @@
               <w:rPr>
                 <w:sz w:val="19"/>
               </w:rPr>
-              <w:t>Análisis de margen (impacto menor)</w:t>
+              <w:t>Análisis de margen en liquidaciones</w:t>
             </w:r>
           </w:p>
         </w:tc>
@@ -3112,7 +3727,7 @@
         </w:tc>
         <w:tc>
           <w:tcPr>
-            <w:tcW w:type="dxa" w:w="3628"/>
+            <w:tcW w:type="dxa" w:w="1474"/>
           </w:tcPr>
           <w:p>
             <w:r/>
@@ -3120,13 +3735,13 @@
               <w:rPr>
                 <w:sz w:val="19"/>
               </w:rPr>
-              <w:t>Sentido de los negativos y de los ceros de 2022</w:t>
+              <w:t>P29 a P32</w:t>
             </w:r>
           </w:p>
         </w:tc>
         <w:tc>
           <w:tcPr>
-            <w:tcW w:type="dxa" w:w="2041"/>
+            <w:tcW w:type="dxa" w:w="2494"/>
           </w:tcPr>
           <w:p>
             <w:r/>
@@ -3140,7 +3755,7 @@
         </w:tc>
         <w:tc>
           <w:tcPr>
-            <w:tcW w:type="dxa" w:w="1928"/>
+            <w:tcW w:type="dxa" w:w="3628"/>
           </w:tcPr>
           <w:p>
             <w:r/>
@@ -3148,7 +3763,7 @@
               <w:rPr>
                 <w:sz w:val="19"/>
               </w:rPr>
-              <w:t>KPI de desvío contra presupuesto</w:t>
+              <w:t>Indicador de desvío contra presupuesto</w:t>
             </w:r>
           </w:p>
         </w:tc>
@@ -3179,7 +3794,30 @@
           <w:b w:val="0"/>
           <w:i/>
         </w:rPr>
-        <w:t>Los cuatro primeros son bloqueantes para la fase de modelado. Los dos últimos tienen impacto acotado y pueden resolverse en paralelo.</w:t>
+        <w:t>Los cuatro primeros temas son necesarios para avanzar con la etapa de modelado. Los dos últimos tienen un impacto acotado y pueden resolverse en paralelo.</w:t>
+      </w:r>
+    </w:p>
+    <w:p>
+      <w:pPr>
+        <w:spacing w:after="80"/>
+      </w:pPr>
+      <w:r>
+        <w:rPr>
+          <w:b w:val="0"/>
+          <w:i w:val="0"/>
+        </w:rPr>
+      </w:r>
+    </w:p>
+    <w:p>
+      <w:pPr>
+        <w:spacing w:after="80"/>
+      </w:pPr>
+      <w:r>
+        <w:rPr>
+          <w:b w:val="0"/>
+          <w:i/>
+        </w:rPr>
+        <w:t>Quedamos a disposición para coordinar una reunión si resulta más práctico que responder por escrito.</w:t>
       </w:r>
     </w:p>
     <w:sectPr>

</xml_diff>